<commit_message>
Funcionalidad de cambio de color en guitarra de Player
</commit_message>
<xml_diff>
--- a/Documentación/Backlog.docx
+++ b/Documentación/Backlog.docx
@@ -171,17 +171,7 @@
           <w:szCs w:val="32"/>
           <w:lang w:val="es-MX"/>
         </w:rPr>
-        <w:t>2</w:t>
-      </w:r>
-      <w:r>
-        <w:rPr>
-          <w:b/>
-          <w:bCs/>
-          <w:sz w:val="32"/>
-          <w:szCs w:val="32"/>
-          <w:lang w:val="es-MX"/>
-        </w:rPr>
-        <w:t>8</w:t>
+        <w:t>28</w:t>
       </w:r>
       <w:r>
         <w:rPr>
@@ -234,6 +224,68 @@
           <w:lang w:val="es-MX"/>
         </w:rPr>
         <w:t>Agregado de clase PrototipoFuncionalidad para implementación básica de sistema de nodos y aciertos aterrizajes.</w:t>
+      </w:r>
+    </w:p>
+    <w:p>
+      <w:pPr>
+        <w:rPr>
+          <w:lang w:val="es-MX"/>
+        </w:rPr>
+      </w:pPr>
+    </w:p>
+    <w:p>
+      <w:pPr>
+        <w:rPr>
+          <w:b/>
+          <w:bCs/>
+          <w:sz w:val="32"/>
+          <w:szCs w:val="32"/>
+          <w:lang w:val="es-MX"/>
+        </w:rPr>
+      </w:pPr>
+      <w:r>
+        <w:rPr>
+          <w:b/>
+          <w:bCs/>
+          <w:sz w:val="32"/>
+          <w:szCs w:val="32"/>
+          <w:lang w:val="es-MX"/>
+        </w:rPr>
+        <w:t>30</w:t>
+      </w:r>
+      <w:r>
+        <w:rPr>
+          <w:b/>
+          <w:bCs/>
+          <w:sz w:val="32"/>
+          <w:szCs w:val="32"/>
+          <w:lang w:val="es-MX"/>
+        </w:rPr>
+        <w:t>/10</w:t>
+      </w:r>
+    </w:p>
+    <w:p>
+      <w:pPr>
+        <w:pStyle w:val="Prrafodelista"/>
+        <w:numPr>
+          <w:ilvl w:val="0"/>
+          <w:numId w:val="4"/>
+        </w:numPr>
+        <w:rPr>
+          <w:lang w:val="es-MX"/>
+        </w:rPr>
+      </w:pPr>
+      <w:r>
+        <w:rPr>
+          <w:lang w:val="es-MX"/>
+        </w:rPr>
+        <w:t>Funcionalidad de cambio de color de guitarra con la siguiente nota</w:t>
+      </w:r>
+      <w:r>
+        <w:rPr>
+          <w:lang w:val="es-MX"/>
+        </w:rPr>
+        <w:t>.</w:t>
       </w:r>
     </w:p>
     <w:sectPr>

</xml_diff>

<commit_message>
Implementación de sistema de Vida. Ajustes en Player, main y Prototipo
</commit_message>
<xml_diff>
--- a/Documentación/Backlog.docx
+++ b/Documentación/Backlog.docx
@@ -236,6 +236,13 @@
     <w:p>
       <w:pPr>
         <w:rPr>
+          <w:lang w:val="es-MX"/>
+        </w:rPr>
+      </w:pPr>
+    </w:p>
+    <w:p>
+      <w:pPr>
+        <w:rPr>
           <w:b/>
           <w:bCs/>
           <w:sz w:val="32"/>
@@ -279,13 +286,152 @@
         <w:rPr>
           <w:lang w:val="es-MX"/>
         </w:rPr>
-        <w:t>Funcionalidad de cambio de color de guitarra con la siguiente nota</w:t>
+        <w:t>Funcionalidad de cambio de color de guitarra con la siguiente nota.</w:t>
+      </w:r>
+    </w:p>
+    <w:p>
+      <w:pPr>
+        <w:rPr>
+          <w:lang w:val="es-MX"/>
+        </w:rPr>
+      </w:pPr>
+    </w:p>
+    <w:p>
+      <w:pPr>
+        <w:rPr>
+          <w:lang w:val="es-MX"/>
+        </w:rPr>
+      </w:pPr>
+    </w:p>
+    <w:p>
+      <w:pPr>
+        <w:rPr>
+          <w:b/>
+          <w:bCs/>
+          <w:sz w:val="32"/>
+          <w:szCs w:val="32"/>
+          <w:lang w:val="es-MX"/>
+        </w:rPr>
+      </w:pPr>
+      <w:r>
+        <w:rPr>
+          <w:b/>
+          <w:bCs/>
+          <w:sz w:val="32"/>
+          <w:szCs w:val="32"/>
+          <w:lang w:val="es-MX"/>
+        </w:rPr>
+        <w:t>05</w:t>
       </w:r>
       <w:r>
         <w:rPr>
-          <w:lang w:val="es-MX"/>
-        </w:rPr>
-        <w:t>.</w:t>
+          <w:b/>
+          <w:bCs/>
+          <w:sz w:val="32"/>
+          <w:szCs w:val="32"/>
+          <w:lang w:val="es-MX"/>
+        </w:rPr>
+        <w:t>/</w:t>
+      </w:r>
+      <w:r>
+        <w:rPr>
+          <w:b/>
+          <w:bCs/>
+          <w:sz w:val="32"/>
+          <w:szCs w:val="32"/>
+          <w:lang w:val="es-MX"/>
+        </w:rPr>
+        <w:t>11</w:t>
+      </w:r>
+    </w:p>
+    <w:p>
+      <w:pPr>
+        <w:pStyle w:val="Prrafodelista"/>
+        <w:numPr>
+          <w:ilvl w:val="0"/>
+          <w:numId w:val="4"/>
+        </w:numPr>
+        <w:rPr>
+          <w:lang w:val="es-MX"/>
+        </w:rPr>
+      </w:pPr>
+      <w:r>
+        <w:rPr>
+          <w:lang w:val="es-MX"/>
+        </w:rPr>
+        <w:t>Implementación de clase Vida.</w:t>
+      </w:r>
+    </w:p>
+    <w:p>
+      <w:pPr>
+        <w:pStyle w:val="Prrafodelista"/>
+        <w:numPr>
+          <w:ilvl w:val="0"/>
+          <w:numId w:val="4"/>
+        </w:numPr>
+        <w:rPr>
+          <w:lang w:val="es-MX"/>
+        </w:rPr>
+      </w:pPr>
+      <w:r>
+        <w:rPr>
+          <w:lang w:val="es-MX"/>
+        </w:rPr>
+        <w:t>Agregado de atributo Vida en clase Player por medio de composición.</w:t>
+      </w:r>
+    </w:p>
+    <w:p>
+      <w:pPr>
+        <w:pStyle w:val="Prrafodelista"/>
+        <w:numPr>
+          <w:ilvl w:val="0"/>
+          <w:numId w:val="4"/>
+        </w:numPr>
+        <w:rPr>
+          <w:lang w:val="es-MX"/>
+        </w:rPr>
+      </w:pPr>
+      <w:r>
+        <w:rPr>
+          <w:lang w:val="es-MX"/>
+        </w:rPr>
+        <w:t>Cambio de nombre de clase Song a AudioControl.</w:t>
+      </w:r>
+    </w:p>
+    <w:p>
+      <w:pPr>
+        <w:pStyle w:val="Prrafodelista"/>
+        <w:numPr>
+          <w:ilvl w:val="0"/>
+          <w:numId w:val="4"/>
+        </w:numPr>
+        <w:rPr>
+          <w:lang w:val="es-MX"/>
+        </w:rPr>
+      </w:pPr>
+      <w:r>
+        <w:rPr>
+          <w:lang w:val="es-MX"/>
+        </w:rPr>
+        <w:t>Ajustes menores en main y PrototipoFuncionalidad para que trabajen en conjunto con Player (y Vida).</w:t>
+      </w:r>
+    </w:p>
+    <w:p>
+      <w:pPr>
+        <w:pStyle w:val="Prrafodelista"/>
+        <w:numPr>
+          <w:ilvl w:val="0"/>
+          <w:numId w:val="4"/>
+        </w:numPr>
+        <w:rPr>
+          <w:lang w:val="es-MX"/>
+        </w:rPr>
+      </w:pPr>
+      <w:r>
+        <w:rPr>
+          <w:lang w:val="es-MX"/>
+        </w:rPr>
+        <w:t>La nueva funcionalidad de Vida permite que la clase PrototipoFuncionalidad llame a métodos de la clase Player para modificarle la vida (volumen) en caso de fallas o aciertos.</w:t>
       </w:r>
     </w:p>
     <w:sectPr>
@@ -1167,7 +1313,7 @@
   <w:style w:type="paragraph" w:default="1" w:styleId="Normal">
     <w:name w:val="Normal"/>
     <w:qFormat/>
-    <w:rsid w:val="00CC2CB1"/>
+    <w:rsid w:val="00214E8C"/>
   </w:style>
   <w:style w:type="paragraph" w:styleId="Ttulo1">
     <w:name w:val="heading 1"/>

</xml_diff>